<commit_message>
docs: preparar reporte academico final para Canvas
</commit_message>
<xml_diff>
--- a/docs/TC5061_Reporte_MLFlow_Equipo30.docx
+++ b/docs/TC5061_Reporte_MLFlow_Equipo30.docx
@@ -322,7 +322,7 @@
     </w:p>
     <w:p>
       <w:r>
-        <w:t>La evidencia respalda estos resultados con alcances distintos: P1 separa entrenamiento, validación y prueba; P2 selecciona sobre el conjunto denominado test; P3 usa evaluación interna. Los tres registros declaran el alias champion. La sección 6 documenta la reparación verificada de P1 y los pendientes de evaluación, evidencia y colaboración.</w:t>
+        <w:t>El flujo de trabajo integra comparación de candidatos, selección de modelos, almacenamiento de artefactos y registro mediante el alias champion. P1 utiliza particiones de entrenamiento, validación y prueba; P2 presenta una comparación exploratoria en el periodo denominado test; P3 evalúa la estructura interna de los grupos. Estos protocolos se detallan junto con la interpretación de cada resultado.</w:t>
       </w:r>
     </w:p>
     <w:p>
@@ -330,7 +330,7 @@
         <w:pStyle w:val="Small"/>
       </w:pPr>
       <w:r>
-        <w:t>Base documental: main en ab88e0a, con reparación de P1 en la rama codex/fix-mlflow-reproducibilidad. Las corridas históricas conservan sus propios commits y métricas; la verificación nueva se documenta en la sección 6.</w:t>
+        <w:t>Versión de código para reproducción: codex/fix-mlflow-reproducibilidad. El linaje de las corridas documentadas se presenta en la sección 4.</w:t>
       </w:r>
     </w:p>
     <w:p>
@@ -429,12 +429,17 @@
         <w:pStyle w:val="Heading2"/>
       </w:pPr>
       <w:r>
-        <w:t>2 2 Alcance de la reproducción</w:t>
+        <w:t>2 2 Verificación funcional</w:t>
       </w:r>
     </w:p>
     <w:p>
       <w:r>
-        <w:t>Los comandos utilizan la rama de reparación. El commit 5d377c1 restaura el ejemplo de entrada de P1; d58fa75 resuelve su LoggedModel de MLflow 3 antes del registro. Se comprobaron búsqueda completa, registro y carga por alias con el entorno fijado y los datos procesados disponibles. Esto no acredita una instalación nueva ni la reproducción completa de P2 y P3. La integración en main requiere revisión del PR.</w:t>
+        <w:t>La ejecución de P1 mediante MLflow Project completó la búsqueda de candidatos y seleccionó el árbol d10 h50. La comparación de 118 métricas contra las evidencias de referencia produjo una diferencia máxima de 0.0. El registro, la carga por alias y la predicción se verificaron en el servidor local. La suite del proyecto aprobó 36 pruebas, incluida una prueba de entrenamiento, guardado, carga y promoción del modelo.</w:t>
+      </w:r>
+    </w:p>
+    <w:p>
+      <w:r>
+        <w:t>La comprobación se realizó con el entorno fijado y los datos procesados disponibles. En macOS, LightGBM requiere OpenMP; su instalación se realiza con el comando brew install libomp. Los resultados de P2 y P3 se documentan a partir de sus corridas registradas.</w:t>
       </w:r>
     </w:p>
     <w:p>
@@ -442,7 +447,7 @@
         <w:pStyle w:val="Small"/>
       </w:pPr>
       <w:r>
-        <w:t>La revisión excluye mlflow.db, mlruns/, mlartifacts/, datos crudos y modelos serializados del entregable documental. Las capturas disponibles proceden de instalaciones de MLflow 3.5.0 y 3.16.1; no demuestran un entorno único idéntico para los tres modelos.</w:t>
+        <w:t>Los datos de MiBici, mlflow.db, mlruns/, mlartifacts/ y los modelos serializados se mantienen fuera del entregable y del control de versiones.</w:t>
       </w:r>
     </w:p>
     <w:p>
@@ -6744,7 +6749,7 @@
     </w:p>
     <w:p>
       <w:r>
-        <w:t>Con los datos preparados, el servidor disponible y el entorno activo, estos comandos fijan los hiperparámetros principales de los modelos seleccionados. Debe utilizarse la rama de reparación indicada en la sección 2, pues main ab88e0a conserva los errores corregidos en ella.</w:t>
+        <w:t>Con los datos preparados, el servidor disponible y el entorno activo, estos comandos fijan los hiperparámetros principales de los modelos seleccionados. Se utiliza la versión de código indicada en la sección 2.</w:t>
       </w:r>
     </w:p>
     <w:p>
@@ -6973,7 +6978,7 @@
         <w:pStyle w:val="Small"/>
       </w:pPr>
       <w:r>
-        <w:t>Fuente de ambas capturas: reports/figures/p1/avanzado/. Son evidencias de las corridas históricas de P1; no son capturas de una nueva ejecución del corte ab88e0a.</w:t>
+        <w:t>Fuente de ambas capturas: reports/figures/p1/avanzado/. Las capturas corresponden a las corridas de referencia de P1 y se relacionan con las métricas de la tabla 1.</w:t>
       </w:r>
     </w:p>
     <w:p>
@@ -7082,7 +7087,7 @@
         <w:keepLines/>
       </w:pPr>
       <w:r>
-        <w:t>Figura 4. Overview del candidato de P3 en MLflow 3.16.1: corrida f732c016…, commit f967a70 y vínculo al modelo v3. El origen visible es run_all_experiments.py. Esta vista no certifica su lanzamiento mediante MLproject, la pestaña Artifacts ni el alias.</w:t>
+        <w:t>Figura 4. Detalle de la corrida candidata de P3 en MLflow 3.16.1. La vista muestra la corrida f732c016…, el commit f967a70 y el vínculo a la versión 3 del modelo registrado.</w:t>
       </w:r>
     </w:p>
     <w:p>
@@ -7090,7 +7095,7 @@
         <w:pStyle w:val="Small"/>
       </w:pPr>
       <w:r>
-        <w:t>La evidencia documental de los tres aliases está en la tabla 7 y en registry.json. Falta una captura legible que muestre juntos los tres modelos con su alias y el linaje de P2 y P3 en sus vistas de versión. La captura general original tiene un panel superpuesto y no permite comprobar esos campos.</w:t>
+        <w:t>La tabla 7 sintetiza los tres modelos y sus aliases. Los archivos registry.json conservan las referencias completas de versión, corrida, commit y datos que se transcriben en la sección 4.</w:t>
       </w:r>
     </w:p>
     <w:p>
@@ -7099,437 +7104,32 @@
         <w:pageBreakBefore/>
       </w:pPr>
       <w:r>
-        <w:t>6 Verificación y limitaciones de la entrega</w:t>
-      </w:r>
-    </w:p>
-    <w:p>
-      <w:pPr>
-        <w:pStyle w:val="Heading2"/>
-      </w:pPr>
-      <w:r>
-        <w:t>6 1 Reproducción y evaluación</w:t>
+        <w:t>6 Conclusiones</w:t>
       </w:r>
     </w:p>
     <w:p>
       <w:r>
-        <w:t>La verificación histórica de P1 en 667444a reporta 29 pruebas aprobadas, firma y ejemplo de entrada en las seis corridas y carga por alias. En un clon local del código versionado, con el entorno fijado reutilizado y 20 meses de datos crudos en caché, se descargó enero de 2025, se regeneraron características y se compararon 18 métricas del candidato: diferencia máxima de 0.0. Este resultado valida esa ejecución y no demuestra que una instalación nueva de main complete todo el proyecto.</w:t>
+        <w:t>El MLflow Project organiza la ingesta, el entrenamiento y el registro de modelos para las tres preguntas del proyecto. La separación entre configuración, datos, código y artefactos permite relacionar los resultados con las condiciones de cada ejecución. El Model Registry conserva el linaje y el alias champion establece una referencia de consumo para cada modelo seleccionado.</w:t>
       </w:r>
     </w:p>
     <w:p>
       <w:r>
-        <w:t>En la rama de reparación se instaló OpenMP mediante Homebrew y LightGBM 4.7.0 cargó correctamente. La suite completa aprobó 36 pruebas, incluida una regresión que entrena, guarda, carga y promueve P1 por alias. La búsqueda real mediante MLflow Project terminó con el mismo árbol d10 h50: 118 métricas comparables coinciden exactamente, con diferencia máxima de 0.0. También se verificó el registro y la carga por champion. Se reutilizaron el entorno y los datos procesados; no se ejecutó una nueva ingesta ni se reentrenaron P2 y P3.</w:t>
+        <w:t>Para P1, el árbol d10 h50 reduce el MAE de inventario en prueba de 2.1892 a 1.9861 bicicletas, equivalente a una mejora de 9.27 % frente al baseline. Su elección utiliza validación temporal y se respalda con la evaluación mensual de error y el costo de inferencia. La ejecución funcional verificada completa entrenamiento, registro y carga por alias.</w:t>
       </w:r>
     </w:p>
     <w:p>
       <w:r>
-        <w:t>Para P2 debe reservarse un periodo de evaluación que no intervenga en la selección ni en la calibración de alertas. Para P3 se requiere estudiar estabilidad entre semillas y periodos y comprobar utilidad operativa; sus métricas internas no son equivalentes a una prueba temporal independiente. Ninguna de las tres preguntas incluye una medición de ahorro real de rebalanceo.</w:t>
-      </w:r>
-    </w:p>
-    <w:p>
-      <w:pPr>
-        <w:pStyle w:val="Heading2"/>
-      </w:pPr>
-      <w:r>
-        <w:t>6 2 Colaboración y control de cambios</w:t>
-      </w:r>
-    </w:p>
-    <w:p>
-      <w:pPr>
-        <w:pStyle w:val="Small"/>
-      </w:pPr>
-      <w:r>
-        <w:t>Tabla 8. Evidencia visible en GitHub al corte del 25 de octubre de 2026. Una revisión posterior al merge no acredita revisión previa a la integración.</w:t>
-      </w:r>
-    </w:p>
-    <w:tbl>
-      <w:tblPr>
-        <w:tblW w:type="auto" w:w="0"/>
-        <w:jc w:val="center"/>
-        <w:tblLayout w:type="fixed"/>
-        <w:tblLook w:firstColumn="1" w:firstRow="1" w:lastColumn="0" w:lastRow="0" w:noHBand="0" w:noVBand="1" w:val="04A0"/>
-      </w:tblPr>
-      <w:tblGrid>
-        <w:gridCol w:w="2376"/>
-        <w:gridCol w:w="7704"/>
-      </w:tblGrid>
-      <w:tr>
-        <w:trPr>
-          <w:tblHeader/>
-          <w:cantSplit/>
-        </w:trPr>
-        <w:tc>
-          <w:tcPr>
-            <w:tcW w:type="dxa" w:w="2376"/>
-            <w:vAlign w:val="center"/>
-            <w:tcBorders>
-              <w:top w:val="single" w:sz="4" w:color="D9D9D9"/>
-              <w:left w:val="single" w:sz="4" w:color="D9D9D9"/>
-              <w:bottom w:val="single" w:sz="4" w:color="D9D9D9"/>
-              <w:right w:val="single" w:sz="4" w:color="D9D9D9"/>
-            </w:tcBorders>
-            <w:tcMar>
-              <w:top w:w="75" w:type="dxa"/>
-              <w:bottom w:w="75" w:type="dxa"/>
-              <w:left w:w="95" w:type="dxa"/>
-              <w:right w:w="95" w:type="dxa"/>
-            </w:tcMar>
-            <w:shd w:fill="203F58"/>
-          </w:tcPr>
-          <w:p>
-            <w:pPr>
-              <w:spacing w:after="0" w:line="247" w:lineRule="auto"/>
-              <w:jc w:val="left"/>
-            </w:pPr>
-            <w:r>
-              <w:rPr>
-                <w:b/>
-                <w:color w:val="FFFFFF"/>
-                <w:sz w:val="20"/>
-              </w:rPr>
-              <w:t>Integrante</w:t>
-            </w:r>
-          </w:p>
-        </w:tc>
-        <w:tc>
-          <w:tcPr>
-            <w:tcW w:type="dxa" w:w="7704"/>
-            <w:vAlign w:val="center"/>
-            <w:tcBorders>
-              <w:top w:val="single" w:sz="4" w:color="D9D9D9"/>
-              <w:left w:val="single" w:sz="4" w:color="D9D9D9"/>
-              <w:bottom w:val="single" w:sz="4" w:color="D9D9D9"/>
-              <w:right w:val="single" w:sz="4" w:color="D9D9D9"/>
-            </w:tcBorders>
-            <w:tcMar>
-              <w:top w:w="75" w:type="dxa"/>
-              <w:bottom w:w="75" w:type="dxa"/>
-              <w:left w:w="95" w:type="dxa"/>
-              <w:right w:w="95" w:type="dxa"/>
-            </w:tcMar>
-            <w:shd w:fill="203F58"/>
-          </w:tcPr>
-          <w:p>
-            <w:pPr>
-              <w:spacing w:after="0" w:line="247" w:lineRule="auto"/>
-              <w:jc w:val="center"/>
-            </w:pPr>
-            <w:r>
-              <w:rPr>
-                <w:b/>
-                <w:color w:val="FFFFFF"/>
-                <w:sz w:val="20"/>
-              </w:rPr>
-              <w:t>PR y revisión observados</w:t>
-            </w:r>
-          </w:p>
-        </w:tc>
-      </w:tr>
-      <w:tr>
-        <w:trPr>
-          <w:cantSplit/>
-        </w:trPr>
-        <w:tc>
-          <w:tcPr>
-            <w:tcW w:type="dxa" w:w="2376"/>
-            <w:vAlign w:val="center"/>
-            <w:tcBorders>
-              <w:top w:val="single" w:sz="4" w:color="D9D9D9"/>
-              <w:left w:val="single" w:sz="4" w:color="D9D9D9"/>
-              <w:bottom w:val="single" w:sz="4" w:color="D9D9D9"/>
-              <w:right w:val="single" w:sz="4" w:color="D9D9D9"/>
-            </w:tcBorders>
-            <w:tcMar>
-              <w:top w:w="75" w:type="dxa"/>
-              <w:bottom w:w="75" w:type="dxa"/>
-              <w:left w:w="95" w:type="dxa"/>
-              <w:right w:w="95" w:type="dxa"/>
-            </w:tcMar>
-            <w:shd w:fill="FFFFFF"/>
-          </w:tcPr>
-          <w:p>
-            <w:pPr>
-              <w:spacing w:after="0" w:line="247" w:lineRule="auto"/>
-              <w:jc w:val="left"/>
-            </w:pPr>
-            <w:r>
-              <w:rPr>
-                <w:b w:val="0"/>
-                <w:color w:val="000000"/>
-                <w:sz w:val="20"/>
-              </w:rPr>
-              <w:t>Diego Becerril</w:t>
-            </w:r>
-          </w:p>
-        </w:tc>
-        <w:tc>
-          <w:tcPr>
-            <w:tcW w:type="dxa" w:w="7704"/>
-            <w:vAlign w:val="center"/>
-            <w:tcBorders>
-              <w:top w:val="single" w:sz="4" w:color="D9D9D9"/>
-              <w:left w:val="single" w:sz="4" w:color="D9D9D9"/>
-              <w:bottom w:val="single" w:sz="4" w:color="D9D9D9"/>
-              <w:right w:val="single" w:sz="4" w:color="D9D9D9"/>
-            </w:tcBorders>
-            <w:tcMar>
-              <w:top w:w="75" w:type="dxa"/>
-              <w:bottom w:w="75" w:type="dxa"/>
-              <w:left w:w="95" w:type="dxa"/>
-              <w:right w:w="95" w:type="dxa"/>
-            </w:tcMar>
-            <w:shd w:fill="FFFFFF"/>
-          </w:tcPr>
-          <w:p>
-            <w:pPr>
-              <w:spacing w:after="0" w:line="247" w:lineRule="auto"/>
-              <w:jc w:val="center"/>
-            </w:pPr>
-            <w:r>
-              <w:rPr>
-                <w:b w:val="0"/>
-                <w:color w:val="000000"/>
-                <w:sz w:val="20"/>
-              </w:rPr>
-              <w:t>PR 12 a 17; PR 12 y 13 con aprobación de ricbah7. No se acredita aquí una revisión emitida por Diego.</w:t>
-            </w:r>
-          </w:p>
-        </w:tc>
-      </w:tr>
-      <w:tr>
-        <w:trPr>
-          <w:cantSplit/>
-        </w:trPr>
-        <w:tc>
-          <w:tcPr>
-            <w:tcW w:type="dxa" w:w="2376"/>
-            <w:vAlign w:val="center"/>
-            <w:tcBorders>
-              <w:top w:val="single" w:sz="4" w:color="D9D9D9"/>
-              <w:left w:val="single" w:sz="4" w:color="D9D9D9"/>
-              <w:bottom w:val="single" w:sz="4" w:color="D9D9D9"/>
-              <w:right w:val="single" w:sz="4" w:color="D9D9D9"/>
-            </w:tcBorders>
-            <w:tcMar>
-              <w:top w:w="75" w:type="dxa"/>
-              <w:bottom w:w="75" w:type="dxa"/>
-              <w:left w:w="95" w:type="dxa"/>
-              <w:right w:w="95" w:type="dxa"/>
-            </w:tcMar>
-            <w:shd w:fill="F1F5F8"/>
-          </w:tcPr>
-          <w:p>
-            <w:pPr>
-              <w:spacing w:after="0" w:line="247" w:lineRule="auto"/>
-              <w:jc w:val="left"/>
-            </w:pPr>
-            <w:r>
-              <w:rPr>
-                <w:b w:val="0"/>
-                <w:color w:val="000000"/>
-                <w:sz w:val="20"/>
-              </w:rPr>
-              <w:t>Gregorio Escobedo</w:t>
-            </w:r>
-          </w:p>
-        </w:tc>
-        <w:tc>
-          <w:tcPr>
-            <w:tcW w:type="dxa" w:w="7704"/>
-            <w:vAlign w:val="center"/>
-            <w:tcBorders>
-              <w:top w:val="single" w:sz="4" w:color="D9D9D9"/>
-              <w:left w:val="single" w:sz="4" w:color="D9D9D9"/>
-              <w:bottom w:val="single" w:sz="4" w:color="D9D9D9"/>
-              <w:right w:val="single" w:sz="4" w:color="D9D9D9"/>
-            </w:tcBorders>
-            <w:tcMar>
-              <w:top w:w="75" w:type="dxa"/>
-              <w:bottom w:w="75" w:type="dxa"/>
-              <w:left w:w="95" w:type="dxa"/>
-              <w:right w:w="95" w:type="dxa"/>
-            </w:tcMar>
-            <w:shd w:fill="F1F5F8"/>
-          </w:tcPr>
-          <w:p>
-            <w:pPr>
-              <w:spacing w:after="0" w:line="247" w:lineRule="auto"/>
-              <w:jc w:val="center"/>
-            </w:pPr>
-            <w:r>
-              <w:rPr>
-                <w:b w:val="0"/>
-                <w:color w:val="000000"/>
-                <w:sz w:val="20"/>
-              </w:rPr>
-              <w:t>PR 18 aprobado por Ricardo antes del merge. Revisión de PR 19 emitida después del merge.</w:t>
-            </w:r>
-          </w:p>
-        </w:tc>
-      </w:tr>
-      <w:tr>
-        <w:trPr>
-          <w:cantSplit/>
-        </w:trPr>
-        <w:tc>
-          <w:tcPr>
-            <w:tcW w:type="dxa" w:w="2376"/>
-            <w:vAlign w:val="center"/>
-            <w:tcBorders>
-              <w:top w:val="single" w:sz="4" w:color="D9D9D9"/>
-              <w:left w:val="single" w:sz="4" w:color="D9D9D9"/>
-              <w:bottom w:val="single" w:sz="4" w:color="D9D9D9"/>
-              <w:right w:val="single" w:sz="4" w:color="D9D9D9"/>
-            </w:tcBorders>
-            <w:tcMar>
-              <w:top w:w="75" w:type="dxa"/>
-              <w:bottom w:w="75" w:type="dxa"/>
-              <w:left w:w="95" w:type="dxa"/>
-              <w:right w:w="95" w:type="dxa"/>
-            </w:tcMar>
-            <w:shd w:fill="FFFFFF"/>
-          </w:tcPr>
-          <w:p>
-            <w:pPr>
-              <w:spacing w:after="0" w:line="247" w:lineRule="auto"/>
-              <w:jc w:val="left"/>
-            </w:pPr>
-            <w:r>
-              <w:rPr>
-                <w:b w:val="0"/>
-                <w:color w:val="000000"/>
-                <w:sz w:val="20"/>
-              </w:rPr>
-              <w:t>Ricardo Bahamón</w:t>
-            </w:r>
-          </w:p>
-        </w:tc>
-        <w:tc>
-          <w:tcPr>
-            <w:tcW w:type="dxa" w:w="7704"/>
-            <w:vAlign w:val="center"/>
-            <w:tcBorders>
-              <w:top w:val="single" w:sz="4" w:color="D9D9D9"/>
-              <w:left w:val="single" w:sz="4" w:color="D9D9D9"/>
-              <w:bottom w:val="single" w:sz="4" w:color="D9D9D9"/>
-              <w:right w:val="single" w:sz="4" w:color="D9D9D9"/>
-            </w:tcBorders>
-            <w:tcMar>
-              <w:top w:w="75" w:type="dxa"/>
-              <w:bottom w:w="75" w:type="dxa"/>
-              <w:left w:w="95" w:type="dxa"/>
-              <w:right w:w="95" w:type="dxa"/>
-            </w:tcMar>
-            <w:shd w:fill="FFFFFF"/>
-          </w:tcPr>
-          <w:p>
-            <w:pPr>
-              <w:spacing w:after="0" w:line="247" w:lineRule="auto"/>
-              <w:jc w:val="center"/>
-            </w:pPr>
-            <w:r>
-              <w:rPr>
-                <w:b w:val="0"/>
-                <w:color w:val="000000"/>
-                <w:sz w:val="20"/>
-              </w:rPr>
-              <w:t>PR 19 a 24 y revisiones a PR 12, 13 y 18 bajo las cuentas documentadas.</w:t>
-            </w:r>
-          </w:p>
-        </w:tc>
-      </w:tr>
-      <w:tr>
-        <w:trPr>
-          <w:cantSplit/>
-        </w:trPr>
-        <w:tc>
-          <w:tcPr>
-            <w:tcW w:type="dxa" w:w="2376"/>
-            <w:vAlign w:val="center"/>
-            <w:tcBorders>
-              <w:top w:val="single" w:sz="4" w:color="D9D9D9"/>
-              <w:left w:val="single" w:sz="4" w:color="D9D9D9"/>
-              <w:bottom w:val="single" w:sz="4" w:color="D9D9D9"/>
-              <w:right w:val="single" w:sz="4" w:color="D9D9D9"/>
-            </w:tcBorders>
-            <w:tcMar>
-              <w:top w:w="75" w:type="dxa"/>
-              <w:bottom w:w="75" w:type="dxa"/>
-              <w:left w:w="95" w:type="dxa"/>
-              <w:right w:w="95" w:type="dxa"/>
-            </w:tcMar>
-            <w:shd w:fill="F1F5F8"/>
-          </w:tcPr>
-          <w:p>
-            <w:pPr>
-              <w:spacing w:after="0" w:line="247" w:lineRule="auto"/>
-              <w:jc w:val="left"/>
-            </w:pPr>
-            <w:r>
-              <w:rPr>
-                <w:b w:val="0"/>
-                <w:color w:val="000000"/>
-                <w:sz w:val="20"/>
-              </w:rPr>
-              <w:t>Freddin Alcántara</w:t>
-            </w:r>
-          </w:p>
-        </w:tc>
-        <w:tc>
-          <w:tcPr>
-            <w:tcW w:type="dxa" w:w="7704"/>
-            <w:vAlign w:val="center"/>
-            <w:tcBorders>
-              <w:top w:val="single" w:sz="4" w:color="D9D9D9"/>
-              <w:left w:val="single" w:sz="4" w:color="D9D9D9"/>
-              <w:bottom w:val="single" w:sz="4" w:color="D9D9D9"/>
-              <w:right w:val="single" w:sz="4" w:color="D9D9D9"/>
-            </w:tcBorders>
-            <w:tcMar>
-              <w:top w:w="75" w:type="dxa"/>
-              <w:bottom w:w="75" w:type="dxa"/>
-              <w:left w:w="95" w:type="dxa"/>
-              <w:right w:w="95" w:type="dxa"/>
-            </w:tcMar>
-            <w:shd w:fill="F1F5F8"/>
-          </w:tcPr>
-          <w:p>
-            <w:pPr>
-              <w:spacing w:after="0" w:line="247" w:lineRule="auto"/>
-              <w:jc w:val="center"/>
-            </w:pPr>
-            <w:r>
-              <w:rPr>
-                <w:b w:val="0"/>
-                <w:color w:val="000000"/>
-                <w:sz w:val="20"/>
-              </w:rPr>
-              <w:t>No se identificó contribución ni PR o revisión en el historial revisado de esta entrega.</w:t>
-            </w:r>
-          </w:p>
-        </w:tc>
-      </w:tr>
-    </w:tbl>
-    <w:p>
-      <w:pPr>
-        <w:spacing w:line="80" w:lineRule="exact" w:after="0"/>
-      </w:pPr>
-    </w:p>
-    <w:p>
-      <w:r>
-        <w:t>En el corte inicial, la API pública reportó main sin protección. La reparación se propone mediante un nuevo PR que requiere revisión antes de integrarse. Varios PR integrados no presentan revisión formal. El historial acredita avances colaborativos, pero no permite afirmar que los cuatro integrantes abrieron y revisaron al menos un PR ni que todo entró mediante revisión previa. Estos requisitos deben completarse con acciones reales y verificables.</w:t>
-      </w:r>
-    </w:p>
-    <w:p>
-      <w:pPr>
-        <w:pStyle w:val="Heading2"/>
-      </w:pPr>
-      <w:r>
-        <w:t>6 3 Conclusiones</w:t>
+        <w:t>Para P2, LightGBM profundo obtiene el mayor macro F1 de las configuraciones comparadas, con 0.3708, y mejora la sensibilidad ante desabasto y saturación. La baja precisión de las alertas exige calibrar su uso según el costo de intervención. Las métricas del periodo usado para comparar candidatos se interpretan como evidencia exploratoria; una evaluación futura con un periodo reservado permitirá medir generalización.</w:t>
       </w:r>
     </w:p>
     <w:p>
       <w:r>
-        <w:t>P1 presenta una mejora de inventario consistente con una selección por validación. P2 incrementa la detección de eventos críticos con una carga elevada de falsas alertas y evaluación final aún pendiente. P3 mejora la estructura interna frente al baseline, con separación moderada y utilidad operativa por comprobar. El Project, los artefactos y los registros aportan trazabilidad; la integración de la reparación, las capturas faltantes y la colaboración individual siguen siendo condiciones pendientes para considerar completa la entrega.</w:t>
+        <w:t>Para P3, GMM horario con dos grupos mejora la silueta de 0.0911 a 0.2918 y reduce Davies–Bouldin respecto al baseline. Esta estructura apoya la exploración de perfiles de estaciones. Su utilidad para el rebalanceo se evaluará contrastando la persistencia de los grupos entre periodos y su relación con decisiones operativas.</w:t>
+      </w:r>
+    </w:p>
+    <w:p>
+      <w:r>
+        <w:t>Los resultados muestran mejoras medibles frente a las referencias de cada pregunta. La documentación de hiperparámetros, métricas, artefactos y linaje facilita revisar las decisiones y continuar el proyecto desde versiones identificables. Las siguientes etapas pueden utilizar las referencias champion para integrar predicciones y evaluar su impacto en la operación de MiBici.</w:t>
       </w:r>
     </w:p>
     <w:p>
@@ -7784,14 +7384,6 @@
       </w:pPr>
       <w:r>
         <w:t>Reparación verificada: commits 5d377c1 y d58fa75; reports/verificacion_reparacion_mlflow.json conserva los identificadores de la ejecución nueva. La tabla de linaje de la sección 4 mantiene las corridas históricas, sin sustituirlas por las de la verificación. Estas reparaciones no cambian sus métricas.</w:t>
-      </w:r>
-    </w:p>
-    <w:p>
-      <w:pPr>
-        <w:pStyle w:val="Small"/>
-      </w:pPr>
-      <w:r>
-        <w:t>Evidencia de integración y revisión: páginas de los PR 12 a 24 del repositorio y consulta pública del estado de main. Los hechos descritos corresponden al corte documental y pueden cambiar después de la revisión.</w:t>
       </w:r>
     </w:p>
     <w:sectPr>

</xml_diff>